<commit_message>
docs(G1-13): align MVP scope and dependencies
</commit_message>
<xml_diff>
--- a/docs/deliverables/05-需求确认书.docx
+++ b/docs/deliverables/05-需求确认书.docx
@@ -1088,7 +1088,7 @@
                 <w:color w:val="1F1F1F"/>
                 <w:sz w:val="14"/>
               </w:rPr>
-              <w:t>FR-02.1★；FR-02.2★；FR-02.3★；FR-10.1★；FR-11.3★</w:t>
+              <w:t>FR-02.1★；FR-02.2★；FR-02.3★；FR-02.4；FR-10.1★；FR-11.3★</w:t>
             </w:r>
           </w:p>
         </w:tc>
@@ -1109,7 +1109,7 @@
                 <w:color w:val="1F1F1F"/>
                 <w:sz w:val="14"/>
               </w:rPr>
-              <w:t>PE-05 刷新≤2秒/次且不降低亚米级源精度；PE-06 首帧≤3秒；PE-08 ≤2秒；PE-10 综合安防≤30秒。</w:t>
+              <w:t>PE-05 刷新≤2秒/次且不降低亚米级源精度；PE-06 首帧≤3秒；PE-08 ≤2秒；PE-10 综合安防≤30秒；物资站点图层可展示并钻取清单、数量和配置，展示结果与物资台账一致。</w:t>
             </w:r>
           </w:p>
         </w:tc>
@@ -1174,7 +1174,7 @@
                 <w:color w:val="1F1F1F"/>
                 <w:sz w:val="14"/>
               </w:rPr>
-              <w:t>月/季/年演练、任务、评估；移动上报、任务、演练、扫码打卡、物资盘点和打卡预警。</w:t>
+              <w:t>月/季/年演练、任务、评估；移动上报、任务、演练、扫码打卡、物资盘点和打卡预警；以物资台账、临期提醒和盘点计划支撑移动盘点闭环。</w:t>
             </w:r>
           </w:p>
         </w:tc>
@@ -1195,7 +1195,7 @@
                 <w:color w:val="1F1F1F"/>
                 <w:sz w:val="14"/>
               </w:rPr>
-              <w:t>FR-04.1★；FR-04.2★；FR-04.3★；FR-06.1★；FR-06.2★；FR-06.3★；FR-06.4★；FR-08.1★；FR-08.2★；FR-08.4★；FR-08.5★；FR-08.6★</w:t>
+              <w:t>FR-03.3★；FR-03.4★；FR-04.1★；FR-04.2★；FR-04.3★；FR-06.1★；FR-06.2★；FR-06.3★；FR-06.4★；FR-08.1★；FR-08.2★；FR-08.4★；FR-08.5★；FR-08.6★</w:t>
             </w:r>
           </w:p>
         </w:tc>
@@ -1216,7 +1216,7 @@
                 <w:color w:val="1F1F1F"/>
                 <w:sz w:val="14"/>
               </w:rPr>
-              <w:t>滚动六个月核验适用对象每半年至少一次，具备提醒、逾期/未达标、补演或整改、统计及追溯；PE-04 ≥20路且到达率≥99%，PE-09 ≤1秒。</w:t>
+              <w:t>滚动六个月核验适用对象每半年至少一次，具备提醒、逾期/未达标、补演或整改、统计及追溯；物资台账增改查和临期提醒有效，盘点计划生成快照，移动端盘点后自动比对差异并完成复核更新；PE-04 ≥20路且到达率≥99%，PE-09 ≤1秒。</w:t>
             </w:r>
           </w:p>
         </w:tc>
@@ -1494,7 +1494,7 @@
           <w:color w:val="1F1F1F"/>
           <w:sz w:val="20"/>
         </w:rPr>
-        <w:t>五个 MVP 优先形成“预案—事件—指挥—现场执行—评估改进”可验证闭环，并同步前置外部接口、性能和安全验证；待验证事项不表述为已验收。</w:t>
+        <w:t>五个 MVP 优先形成“预案—事件—指挥—现场执行—评估改进”可验证闭环，并同步前置外部接口、性能和安全验证；MVP-2 纳入 FR-02.4 以闭合物资站点一张图，MVP-3 纳入 FR-03.3、FR-03.4 作为 FR-08.6 移动物资盘点的直接数据与流程依赖。待验证事项不表述为已验收。</w:t>
       </w:r>
     </w:p>
     <w:p>
@@ -1522,7 +1522,7 @@
           <w:color w:val="1F1F1F"/>
           <w:sz w:val="20"/>
         </w:rPr>
-        <w:t>FR-01.4、FR-02.4、FR-03.1、FR-03.2、FR-03.3、FR-03.4、FR-07.1、FR-07.2、FR-07.3、FR-07.4、FR-07.5、FR-08.3、FR-09.1，以及相互依赖的配置、数据初始化、文档、培训、试运行和服务，仍须按项目计划实施、测试和验收。全量 39 条 FR 的用例、性能实测和验收证据不得因 MVP 分期而省略。</w:t>
+        <w:t>FR-01.4、FR-03.1、FR-03.2、FR-07.1、FR-07.2、FR-07.3、FR-07.4、FR-07.5、FR-08.3、FR-09.1，以及相互依赖的配置、数据初始化、文档、培训、试运行和服务，仍须按项目计划实施、测试和验收。全量 39 条 FR 的用例、性能实测和验收证据不得因 MVP 分期而省略。</w:t>
       </w:r>
     </w:p>
     <w:p>

</xml_diff>